<commit_message>
Normalize RKA organization naming
</commit_message>
<xml_diff>
--- a/documents/informacionnoe-pismo-zayavka-rka-35-2026.docx
+++ b/documents/informacionnoe-pismo-zayavka-rka-35-2026.docx
@@ -237,19 +237,18 @@
           <w:szCs w:val="24"/>
           <w:lang w:eastAsia="ru-RU"/>
         </w:rPr>
-        <w:t>Российская криминологическая ассоциация</w:t>
-      </w:r>
-      <w:r>
-        <w:rPr>
-          <w:rFonts w:eastAsia="Times New Roman" w:cs="Times New Roman"/>
-          <w:b/>
-          <w:bCs/>
-          <w:color w:val="222222"/>
-          <w:sz w:val="24"/>
-          <w:szCs w:val="24"/>
-          <w:lang w:eastAsia="ru-RU"/>
-        </w:rPr>
-        <w:t xml:space="preserve"> имени Азалии Ивановны Долговой</w:t>
+        <w:t>Общероссийская общественная организация «Российская криминологическая ассоциация имени Азалии Ивановны Долговой»</w:t>
+      </w:r>
+      <w:r>
+        <w:rPr>
+          <w:rFonts w:eastAsia="Times New Roman" w:cs="Times New Roman"/>
+          <w:b/>
+          <w:bCs/>
+          <w:color w:val="222222"/>
+          <w:sz w:val="24"/>
+          <w:szCs w:val="24"/>
+          <w:lang w:eastAsia="ru-RU"/>
+        </w:rPr>
       </w:r>
     </w:p>
     <w:p>
@@ -585,7 +584,7 @@
           <w:sz w:val="24"/>
           <w:szCs w:val="24"/>
         </w:rPr>
-        <w:t xml:space="preserve"> к 35-летию РКА им. А.И. Долговой и Году единства народов России</w:t>
+        <w:t xml:space="preserve"> к 35-летию «РКА им. А.И. Долговой» и Году единства народов России</w:t>
       </w:r>
       <w:r>
         <w:rPr>
@@ -2653,7 +2652,7 @@
           <w:sz w:val="24"/>
           <w:szCs w:val="24"/>
         </w:rPr>
-        <w:t>Всероссийской научно-практической конференции «Преступность и безопасность в регионах России: общее и особенное», приуроченной к 35-летию РКА им. А.И. Долговой</w:t>
+        <w:t>Всероссийской научно-практической конференции «Преступность и безопасность в регионах России: общее и особенное», приуроченной к 35-летию «РКА им. А.И. Долговой»</w:t>
       </w:r>
     </w:p>
     <w:p>
@@ -2894,7 +2893,7 @@
                 <w:sz w:val="24"/>
                 <w:szCs w:val="24"/>
               </w:rPr>
-              <w:t>Членство в РКА (да/нет, с какого года)</w:t>
+              <w:t>Членство в «РКА им. А.И. Долговой» (да/нет, с какого года)</w:t>
             </w:r>
           </w:p>
         </w:tc>

</xml_diff>